<commit_message>
release 0.3.0 Fixing minor flaws
</commit_message>
<xml_diff>
--- a/docs/ITSM_API_Guide.docx
+++ b/docs/ITSM_API_Guide.docx
@@ -7030,6 +7030,33 @@
         <w:rPr>
           <w:rStyle w:val="VerbatimChar"/>
         </w:rPr>
+        <w:t xml:space="preserve">planned_start_date</w:t>
+      </w:r>
+      <w:r>
+        <w:t xml:space="preserve">,</w:t>
+      </w:r>
+      <w:r>
+        <w:t xml:space="preserve"> </w:t>
+      </w:r>
+      <w:r>
+        <w:rPr>
+          <w:rStyle w:val="VerbatimChar"/>
+        </w:rPr>
+        <w:t xml:space="preserve">planned_due_date</w:t>
+      </w:r>
+      <w:r>
+        <w:t xml:space="preserve"> </w:t>
+      </w:r>
+      <w:r>
+        <w:t xml:space="preserve">(початкові значення, лише читання),</w:t>
+      </w:r>
+      <w:r>
+        <w:t xml:space="preserve"> </w:t>
+      </w:r>
+      <w:r>
+        <w:rPr>
+          <w:rStyle w:val="VerbatimChar"/>
+        </w:rPr>
         <w:t xml:space="preserve">milestone</w:t>
       </w:r>
       <w:r>
@@ -7196,7 +7223,22 @@
         <w:t xml:space="preserve"> </w:t>
       </w:r>
       <w:r>
-        <w:t xml:space="preserve">знімає виконавця, етап чи дату. Назву, пріоритет, тип і проєкт через API змінити не можна (422). Правила атомарності й «без шуму» — ті самі, що й для тікетів. Дати перевіряються разом із поточними: новий</w:t>
+        <w:t xml:space="preserve">знімає виконавця, етап чи дату. Назву, пріоритет, тип і проєкт через API змінити не можна (422). Правила атомарності й «без шуму» — ті самі, що й для тікетів. Кожна зміна дат фіксується в історії задачі (початкові значення</w:t>
+      </w:r>
+      <w:r>
+        <w:t xml:space="preserve"> </w:t>
+      </w:r>
+      <w:r>
+        <w:rPr>
+          <w:rStyle w:val="VerbatimChar"/>
+        </w:rPr>
+        <w:t xml:space="preserve">planned_*</w:t>
+      </w:r>
+      <w:r>
+        <w:t xml:space="preserve"> </w:t>
+      </w:r>
+      <w:r>
+        <w:t xml:space="preserve">не змінюються). Дати перевіряються разом із поточними: новий</w:t>
       </w:r>
       <w:r>
         <w:t xml:space="preserve"> </w:t>

</xml_diff>

<commit_message>
version RC1 update add new features
</commit_message>
<xml_diff>
--- a/docs/ITSM_API_Guide.docx
+++ b/docs/ITSM_API_Guide.docx
@@ -6084,7 +6084,148 @@
         <w:t xml:space="preserve">{"body": "Текст"}</w:t>
       </w:r>
       <w:r>
-        <w:t xml:space="preserve">, 1–20 000 символів. Відповідь —</w:t>
+        <w:t xml:space="preserve">, 1–20 000 символів. Для</w:t>
+      </w:r>
+      <w:r>
+        <w:t xml:space="preserve"> </w:t>
+      </w:r>
+      <w:r>
+        <w:rPr>
+          <w:bCs/>
+          <w:b/>
+        </w:rPr>
+        <w:t xml:space="preserve">задач</w:t>
+      </w:r>
+      <w:r>
+        <w:t xml:space="preserve"> </w:t>
+      </w:r>
+      <w:r>
+        <w:rPr>
+          <w:rStyle w:val="VerbatimChar"/>
+        </w:rPr>
+        <w:t xml:space="preserve">body</w:t>
+      </w:r>
+      <w:r>
+        <w:t xml:space="preserve"> </w:t>
+      </w:r>
+      <w:r>
+        <w:t xml:space="preserve">— це текст у форматі</w:t>
+      </w:r>
+      <w:r>
+        <w:t xml:space="preserve"> </w:t>
+      </w:r>
+      <w:r>
+        <w:rPr>
+          <w:bCs/>
+          <w:b/>
+        </w:rPr>
+        <w:t xml:space="preserve">Markdown</w:t>
+      </w:r>
+      <w:r>
+        <w:t xml:space="preserve"> </w:t>
+      </w:r>
+      <w:r>
+        <w:t xml:space="preserve">(веб-інтерфейс відображає його з форматуванням; API повертає його «як є», без HTML). Для</w:t>
+      </w:r>
+      <w:r>
+        <w:t xml:space="preserve"> </w:t>
+      </w:r>
+      <w:r>
+        <w:rPr>
+          <w:bCs/>
+          <w:b/>
+        </w:rPr>
+        <w:t xml:space="preserve">задач</w:t>
+      </w:r>
+      <w:r>
+        <w:t xml:space="preserve"> </w:t>
+      </w:r>
+      <w:r>
+        <w:t xml:space="preserve">додатково можна передати</w:t>
+      </w:r>
+      <w:r>
+        <w:t xml:space="preserve"> </w:t>
+      </w:r>
+      <w:r>
+        <w:rPr>
+          <w:rStyle w:val="VerbatimChar"/>
+        </w:rPr>
+        <w:t xml:space="preserve">hours</w:t>
+      </w:r>
+      <w:r>
+        <w:t xml:space="preserve"> </w:t>
+      </w:r>
+      <w:r>
+        <w:t xml:space="preserve">— витрачений час (число годин</w:t>
+      </w:r>
+      <w:r>
+        <w:t xml:space="preserve"> </w:t>
+      </w:r>
+      <w:r>
+        <w:rPr>
+          <w:rStyle w:val="VerbatimChar"/>
+        </w:rPr>
+        <w:t xml:space="preserve">1.5</w:t>
+      </w:r>
+      <w:r>
+        <w:t xml:space="preserve"> </w:t>
+      </w:r>
+      <w:r>
+        <w:t xml:space="preserve">або рядок</w:t>
+      </w:r>
+      <w:r>
+        <w:t xml:space="preserve"> </w:t>
+      </w:r>
+      <w:r>
+        <w:rPr>
+          <w:rStyle w:val="VerbatimChar"/>
+        </w:rPr>
+        <w:t xml:space="preserve">"1:30"</w:t>
+      </w:r>
+      <w:r>
+        <w:t xml:space="preserve">,</w:t>
+      </w:r>
+      <w:r>
+        <w:t xml:space="preserve"> </w:t>
+      </w:r>
+      <w:r>
+        <w:rPr>
+          <w:rStyle w:val="VerbatimChar"/>
+        </w:rPr>
+        <w:t xml:space="preserve">"90 хв"</w:t>
+      </w:r>
+      <w:r>
+        <w:t xml:space="preserve">; 0–999): коментар до задачі — це запис «Журналу робіт» задачі, а</w:t>
+      </w:r>
+      <w:r>
+        <w:t xml:space="preserve"> </w:t>
+      </w:r>
+      <w:r>
+        <w:rPr>
+          <w:rStyle w:val="VerbatimChar"/>
+        </w:rPr>
+        <w:t xml:space="preserve">hours</w:t>
+      </w:r>
+      <w:r>
+        <w:t xml:space="preserve"> </w:t>
+      </w:r>
+      <w:r>
+        <w:t xml:space="preserve">потрапляє в облік часу. У відповіді задачі поле</w:t>
+      </w:r>
+      <w:r>
+        <w:t xml:space="preserve"> </w:t>
+      </w:r>
+      <w:r>
+        <w:rPr>
+          <w:rStyle w:val="VerbatimChar"/>
+        </w:rPr>
+        <w:t xml:space="preserve">hours</w:t>
+      </w:r>
+      <w:r>
+        <w:t xml:space="preserve"> </w:t>
+      </w:r>
+      <w:r>
+        <w:t xml:space="preserve">є в кожному коментарі. Відповідь —</w:t>
       </w:r>
       <w:r>
         <w:t xml:space="preserve"> </w:t>

</xml_diff>

<commit_message>
version RC1 add new features
</commit_message>
<xml_diff>
--- a/docs/ITSM_API_Guide.docx
+++ b/docs/ITSM_API_Guide.docx
@@ -5756,10 +5756,7 @@
         <w:t xml:space="preserve">status</w:t>
       </w:r>
       <w:r>
-        <w:t xml:space="preserve"> </w:t>
-      </w:r>
-      <w:r>
-        <w:t xml:space="preserve">та</w:t>
+        <w:t xml:space="preserve">,</w:t>
       </w:r>
       <w:r>
         <w:t xml:space="preserve"> </w:t>
@@ -5786,7 +5783,82 @@
         <w:t xml:space="preserve"> </w:t>
       </w:r>
       <w:r>
-        <w:t xml:space="preserve">знімає оператора). Інші (</w:t>
+        <w:t xml:space="preserve">знімає оператора) та</w:t>
+      </w:r>
+      <w:r>
+        <w:t xml:space="preserve"> </w:t>
+      </w:r>
+      <w:r>
+        <w:rPr>
+          <w:rStyle w:val="VerbatimChar"/>
+        </w:rPr>
+        <w:t xml:space="preserve">priority</w:t>
+      </w:r>
+      <w:r>
+        <w:t xml:space="preserve"> </w:t>
+      </w:r>
+      <w:r>
+        <w:t xml:space="preserve">(</w:t>
+      </w:r>
+      <w:r>
+        <w:rPr>
+          <w:rStyle w:val="VerbatimChar"/>
+        </w:rPr>
+        <w:t xml:space="preserve">low</w:t>
+      </w:r>
+      <w:r>
+        <w:t xml:space="preserve">,</w:t>
+      </w:r>
+      <w:r>
+        <w:t xml:space="preserve"> </w:t>
+      </w:r>
+      <w:r>
+        <w:rPr>
+          <w:rStyle w:val="VerbatimChar"/>
+        </w:rPr>
+        <w:t xml:space="preserve">normal</w:t>
+      </w:r>
+      <w:r>
+        <w:t xml:space="preserve">,</w:t>
+      </w:r>
+      <w:r>
+        <w:t xml:space="preserve"> </w:t>
+      </w:r>
+      <w:r>
+        <w:rPr>
+          <w:rStyle w:val="VerbatimChar"/>
+        </w:rPr>
+        <w:t xml:space="preserve">high</w:t>
+      </w:r>
+      <w:r>
+        <w:t xml:space="preserve">,</w:t>
+      </w:r>
+      <w:r>
+        <w:t xml:space="preserve"> </w:t>
+      </w:r>
+      <w:r>
+        <w:rPr>
+          <w:rStyle w:val="VerbatimChar"/>
+        </w:rPr>
+        <w:t xml:space="preserve">critical</w:t>
+      </w:r>
+      <w:r>
+        <w:t xml:space="preserve">; змінювати можуть ті ж ролі, що й призначати оператора). Поле</w:t>
+      </w:r>
+      <w:r>
+        <w:t xml:space="preserve"> </w:t>
+      </w:r>
+      <w:r>
+        <w:rPr>
+          <w:rStyle w:val="VerbatimChar"/>
+        </w:rPr>
+        <w:t xml:space="preserve">priority</w:t>
+      </w:r>
+      <w:r>
+        <w:t xml:space="preserve"> </w:t>
+      </w:r>
+      <w:r>
+        <w:t xml:space="preserve">повертається і в представленні тікета. Строки SLA (прострочення) враховують пріоритет за множниками з налаштувань черг. Інші (</w:t>
       </w:r>
       <w:r>
         <w:rPr>

</xml_diff>